<commit_message>
se agrega la actualización de alrchivo de proyecto y el codigo refactorizado
</commit_message>
<xml_diff>
--- a/Proyecto Final.docx
+++ b/Proyecto Final.docx
@@ -206,6 +206,7 @@
           <w:szCs w:val="24"/>
         </w:rPr>
       </w:pPr>
+      <w:proofErr w:type="spellStart"/>
       <w:r>
         <w:rPr>
           <w:rFonts w:ascii="Arial" w:hAnsi="Arial" w:cs="Arial"/>
@@ -214,7 +215,18 @@
           <w:sz w:val="24"/>
           <w:szCs w:val="24"/>
         </w:rPr>
-        <w:t xml:space="preserve">Jhon </w:t>
+        <w:t>Jhon</w:t>
+      </w:r>
+      <w:proofErr w:type="spellEnd"/>
+      <w:r>
+        <w:rPr>
+          <w:rFonts w:ascii="Arial" w:hAnsi="Arial" w:cs="Arial"/>
+          <w:b/>
+          <w:bCs/>
+          <w:sz w:val="24"/>
+          <w:szCs w:val="24"/>
+        </w:rPr>
+        <w:t xml:space="preserve"> </w:t>
       </w:r>
       <w:proofErr w:type="spellStart"/>
       <w:r>
@@ -6595,6 +6607,7 @@
           <w:rFonts w:ascii="Arial" w:hAnsi="Arial" w:cs="Arial"/>
           <w:b/>
           <w:bCs/>
+          <w:noProof/>
         </w:rPr>
         <w:drawing>
           <wp:inline distT="0" distB="0" distL="0" distR="0" wp14:anchorId="223C21A8" wp14:editId="77E3E78B">
@@ -6682,6 +6695,7 @@
       <w:r>
         <w:rPr>
           <w:rFonts w:ascii="Arial" w:hAnsi="Arial" w:cs="Arial"/>
+          <w:noProof/>
         </w:rPr>
         <w:drawing>
           <wp:inline distT="0" distB="0" distL="0" distR="0" wp14:anchorId="7862AA94" wp14:editId="02A502CD">
@@ -6751,6 +6765,7 @@
       <w:r>
         <w:rPr>
           <w:rFonts w:ascii="Arial" w:hAnsi="Arial" w:cs="Arial"/>
+          <w:noProof/>
         </w:rPr>
         <w:drawing>
           <wp:inline distT="0" distB="0" distL="0" distR="0" wp14:anchorId="1B4B8890" wp14:editId="46A135CF">
@@ -6819,6 +6834,7 @@
       <w:r>
         <w:rPr>
           <w:rFonts w:ascii="Arial" w:hAnsi="Arial" w:cs="Arial"/>
+          <w:noProof/>
         </w:rPr>
         <w:drawing>
           <wp:inline distT="0" distB="0" distL="0" distR="0" wp14:anchorId="580595CB" wp14:editId="5DA6CF17">
@@ -6906,6 +6922,7 @@
       <w:r>
         <w:rPr>
           <w:rFonts w:ascii="Arial" w:hAnsi="Arial" w:cs="Arial"/>
+          <w:noProof/>
         </w:rPr>
         <w:drawing>
           <wp:inline distT="0" distB="0" distL="0" distR="0" wp14:anchorId="0F4D586E" wp14:editId="43299652">
@@ -6974,6 +6991,7 @@
       <w:r>
         <w:rPr>
           <w:rFonts w:ascii="Arial" w:hAnsi="Arial" w:cs="Arial"/>
+          <w:noProof/>
         </w:rPr>
         <w:drawing>
           <wp:inline distT="0" distB="0" distL="0" distR="0" wp14:anchorId="329FD97A" wp14:editId="639099CF">
@@ -7088,11 +7106,12 @@
       <w:r>
         <w:rPr>
           <w:rFonts w:ascii="Arial" w:hAnsi="Arial" w:cs="Arial"/>
+          <w:noProof/>
         </w:rPr>
         <w:drawing>
-          <wp:inline distT="0" distB="0" distL="0" distR="0" wp14:anchorId="437513C5" wp14:editId="67B33341">
-            <wp:extent cx="5545031" cy="4447641"/>
-            <wp:effectExtent l="0" t="0" r="0" b="0"/>
+          <wp:inline distT="0" distB="0" distL="0" distR="0" wp14:anchorId="437513C5" wp14:editId="396DFCB2">
+            <wp:extent cx="4373880" cy="3508265"/>
+            <wp:effectExtent l="0" t="0" r="7620" b="0"/>
             <wp:docPr id="218698416" name="Imagen 1"/>
             <wp:cNvGraphicFramePr>
               <a:graphicFrameLocks xmlns:a="http://schemas.openxmlformats.org/drawingml/2006/main" noChangeAspect="1"/>
@@ -7113,7 +7132,7 @@
                   <pic:spPr>
                     <a:xfrm>
                       <a:off x="0" y="0"/>
-                      <a:ext cx="5548102" cy="4450104"/>
+                      <a:ext cx="4412280" cy="3539066"/>
                     </a:xfrm>
                     <a:prstGeom prst="rect">
                       <a:avLst/>
@@ -7128,200 +7147,44 @@
     </w:p>
     <w:p>
       <w:pPr>
+        <w:rPr>
+          <w:rFonts w:ascii="Arial" w:hAnsi="Arial" w:cs="Arial"/>
+          <w:b/>
+          <w:bCs/>
+        </w:rPr>
+      </w:pPr>
+      <w:r>
+        <w:rPr>
+          <w:rFonts w:ascii="Arial" w:hAnsi="Arial" w:cs="Arial"/>
+        </w:rPr>
+        <w:t xml:space="preserve">     </w:t>
+      </w:r>
+      <w:r>
+        <w:rPr>
+          <w:rFonts w:ascii="Arial" w:hAnsi="Arial" w:cs="Arial"/>
+          <w:b/>
+          <w:bCs/>
+        </w:rPr>
+        <w:t xml:space="preserve"> MENU </w:t>
+      </w:r>
+    </w:p>
+    <w:p>
+      <w:pPr>
         <w:spacing w:line="360" w:lineRule="auto"/>
         <w:ind w:left="360"/>
         <w:rPr>
           <w:rFonts w:ascii="Arial" w:hAnsi="Arial" w:cs="Arial"/>
         </w:rPr>
       </w:pPr>
-    </w:p>
-    <w:p>
-      <w:pPr>
-        <w:rPr>
-          <w:rFonts w:ascii="Arial" w:hAnsi="Arial" w:cs="Arial"/>
-        </w:rPr>
-      </w:pPr>
-    </w:p>
-    <w:p>
-      <w:pPr>
-        <w:rPr>
-          <w:rFonts w:ascii="Arial" w:hAnsi="Arial" w:cs="Arial"/>
-        </w:rPr>
-      </w:pPr>
-    </w:p>
-    <w:p>
-      <w:pPr>
-        <w:rPr>
-          <w:rFonts w:ascii="Arial" w:hAnsi="Arial" w:cs="Arial"/>
-        </w:rPr>
-      </w:pPr>
-    </w:p>
-    <w:p>
-      <w:pPr>
-        <w:rPr>
-          <w:rFonts w:ascii="Arial" w:hAnsi="Arial" w:cs="Arial"/>
-        </w:rPr>
-      </w:pPr>
-    </w:p>
-    <w:p>
-      <w:pPr>
-        <w:rPr>
-          <w:rFonts w:ascii="Arial" w:hAnsi="Arial" w:cs="Arial"/>
-        </w:rPr>
-      </w:pPr>
-    </w:p>
-    <w:p>
-      <w:pPr>
-        <w:rPr>
-          <w:rFonts w:ascii="Arial" w:hAnsi="Arial" w:cs="Arial"/>
-        </w:rPr>
-      </w:pPr>
-    </w:p>
-    <w:p>
-      <w:pPr>
-        <w:rPr>
-          <w:rFonts w:ascii="Arial" w:hAnsi="Arial" w:cs="Arial"/>
-        </w:rPr>
-      </w:pPr>
-    </w:p>
-    <w:p>
-      <w:pPr>
-        <w:rPr>
-          <w:rFonts w:ascii="Arial" w:hAnsi="Arial" w:cs="Arial"/>
-        </w:rPr>
-      </w:pPr>
-    </w:p>
-    <w:p>
-      <w:pPr>
-        <w:rPr>
-          <w:rFonts w:ascii="Arial" w:hAnsi="Arial" w:cs="Arial"/>
-        </w:rPr>
-      </w:pPr>
-    </w:p>
-    <w:p>
-      <w:pPr>
-        <w:rPr>
-          <w:rFonts w:ascii="Arial" w:hAnsi="Arial" w:cs="Arial"/>
-        </w:rPr>
-      </w:pPr>
-    </w:p>
-    <w:p>
-      <w:pPr>
-        <w:rPr>
-          <w:rFonts w:ascii="Arial" w:hAnsi="Arial" w:cs="Arial"/>
-        </w:rPr>
-      </w:pPr>
-    </w:p>
-    <w:p>
-      <w:pPr>
-        <w:rPr>
-          <w:rFonts w:ascii="Arial" w:hAnsi="Arial" w:cs="Arial"/>
-        </w:rPr>
-      </w:pPr>
-    </w:p>
-    <w:p>
-      <w:pPr>
-        <w:rPr>
-          <w:rFonts w:ascii="Arial" w:hAnsi="Arial" w:cs="Arial"/>
-        </w:rPr>
-      </w:pPr>
-    </w:p>
-    <w:p>
-      <w:pPr>
-        <w:rPr>
-          <w:rFonts w:ascii="Arial" w:hAnsi="Arial" w:cs="Arial"/>
-        </w:rPr>
-      </w:pPr>
-    </w:p>
-    <w:p>
-      <w:pPr>
-        <w:rPr>
-          <w:rFonts w:ascii="Arial" w:hAnsi="Arial" w:cs="Arial"/>
-        </w:rPr>
-      </w:pPr>
-    </w:p>
-    <w:p>
-      <w:pPr>
-        <w:rPr>
-          <w:rFonts w:ascii="Arial" w:hAnsi="Arial" w:cs="Arial"/>
-        </w:rPr>
-      </w:pPr>
-    </w:p>
-    <w:p>
-      <w:pPr>
-        <w:rPr>
-          <w:rFonts w:ascii="Arial" w:hAnsi="Arial" w:cs="Arial"/>
-        </w:rPr>
-      </w:pPr>
-    </w:p>
-    <w:p>
-      <w:pPr>
-        <w:rPr>
-          <w:rFonts w:ascii="Arial" w:hAnsi="Arial" w:cs="Arial"/>
-        </w:rPr>
-      </w:pPr>
-    </w:p>
-    <w:p>
-      <w:pPr>
-        <w:rPr>
-          <w:rFonts w:ascii="Arial" w:hAnsi="Arial" w:cs="Arial"/>
-        </w:rPr>
-      </w:pPr>
-    </w:p>
-    <w:p>
-      <w:pPr>
-        <w:rPr>
-          <w:rFonts w:ascii="Arial" w:hAnsi="Arial" w:cs="Arial"/>
-        </w:rPr>
-      </w:pPr>
-    </w:p>
-    <w:p>
-      <w:pPr>
-        <w:rPr>
-          <w:rFonts w:ascii="Arial" w:hAnsi="Arial" w:cs="Arial"/>
-        </w:rPr>
-      </w:pPr>
-    </w:p>
-    <w:p>
-      <w:pPr>
-        <w:rPr>
-          <w:rFonts w:ascii="Arial" w:hAnsi="Arial" w:cs="Arial"/>
-          <w:b/>
-          <w:bCs/>
-        </w:rPr>
-      </w:pPr>
-      <w:r>
-        <w:rPr>
-          <w:rFonts w:ascii="Arial" w:hAnsi="Arial" w:cs="Arial"/>
-        </w:rPr>
-        <w:lastRenderedPageBreak/>
-        <w:t xml:space="preserve">     </w:t>
-      </w:r>
-      <w:r>
-        <w:rPr>
-          <w:rFonts w:ascii="Arial" w:hAnsi="Arial" w:cs="Arial"/>
-          <w:b/>
-          <w:bCs/>
-        </w:rPr>
-        <w:t xml:space="preserve"> MENU </w:t>
-      </w:r>
-    </w:p>
-    <w:p>
-      <w:pPr>
-        <w:spacing w:line="360" w:lineRule="auto"/>
-        <w:ind w:left="360"/>
-        <w:rPr>
-          <w:rFonts w:ascii="Arial" w:hAnsi="Arial" w:cs="Arial"/>
-        </w:rPr>
-      </w:pPr>
-      <w:r>
-        <w:rPr>
-          <w:rFonts w:ascii="Arial" w:hAnsi="Arial" w:cs="Arial"/>
+      <w:r>
+        <w:rPr>
+          <w:rFonts w:ascii="Arial" w:hAnsi="Arial" w:cs="Arial"/>
+          <w:noProof/>
         </w:rPr>
         <w:drawing>
-          <wp:inline distT="0" distB="0" distL="0" distR="0" wp14:anchorId="1B6CF5AA" wp14:editId="3E193128">
-            <wp:extent cx="5229955" cy="5734850"/>
-            <wp:effectExtent l="0" t="0" r="8890" b="0"/>
+          <wp:inline distT="0" distB="0" distL="0" distR="0" wp14:anchorId="1B6CF5AA" wp14:editId="3E083AAA">
+            <wp:extent cx="4335780" cy="4754350"/>
+            <wp:effectExtent l="0" t="0" r="7620" b="8255"/>
             <wp:docPr id="1299510283" name="Imagen 1"/>
             <wp:cNvGraphicFramePr>
               <a:graphicFrameLocks xmlns:a="http://schemas.openxmlformats.org/drawingml/2006/main" noChangeAspect="1"/>
@@ -7342,7 +7205,7 @@
                   <pic:spPr>
                     <a:xfrm>
                       <a:off x="0" y="0"/>
-                      <a:ext cx="5229955" cy="5734850"/>
+                      <a:ext cx="4355530" cy="4776006"/>
                     </a:xfrm>
                     <a:prstGeom prst="rect">
                       <a:avLst/>
@@ -7366,6 +7229,7 @@
       <w:r>
         <w:rPr>
           <w:rFonts w:ascii="Arial" w:hAnsi="Arial" w:cs="Arial"/>
+          <w:noProof/>
         </w:rPr>
         <w:lastRenderedPageBreak/>
         <w:drawing>
@@ -7411,11 +7275,15 @@
         <w:ind w:left="360"/>
         <w:rPr>
           <w:rFonts w:ascii="Arial" w:hAnsi="Arial" w:cs="Arial"/>
-        </w:rPr>
-      </w:pPr>
-      <w:r>
-        <w:rPr>
-          <w:rFonts w:ascii="Arial" w:hAnsi="Arial" w:cs="Arial"/>
+          <w:b/>
+          <w:bCs/>
+        </w:rPr>
+      </w:pPr>
+      <w:r>
+        <w:rPr>
+          <w:rFonts w:ascii="Arial" w:hAnsi="Arial" w:cs="Arial"/>
+          <w:b/>
+          <w:bCs/>
         </w:rPr>
         <w:t xml:space="preserve">EJECUCIÓN </w:t>
       </w:r>
@@ -7431,6 +7299,7 @@
       <w:r>
         <w:rPr>
           <w:rFonts w:ascii="Arial" w:hAnsi="Arial" w:cs="Arial"/>
+          <w:noProof/>
         </w:rPr>
         <w:drawing>
           <wp:inline distT="0" distB="0" distL="0" distR="0" wp14:anchorId="31D26530" wp14:editId="1F903B76">
@@ -7561,7 +7430,7 @@
     </w:p>
     <w:p>
       <w:pPr>
-        <w:spacing w:line="360" w:lineRule="auto"/>
+        <w:spacing w:line="240" w:lineRule="auto"/>
         <w:rPr>
           <w:rFonts w:ascii="Arial" w:hAnsi="Arial" w:cs="Arial"/>
         </w:rPr>
@@ -7673,7 +7542,7 @@
     </w:p>
     <w:p>
       <w:pPr>
-        <w:spacing w:line="360" w:lineRule="auto"/>
+        <w:spacing w:line="240" w:lineRule="auto"/>
         <w:jc w:val="center"/>
         <w:rPr>
           <w:rFonts w:ascii="Arial" w:hAnsi="Arial" w:cs="Arial"/>
@@ -7685,9 +7554,9 @@
           <w:noProof/>
         </w:rPr>
         <w:drawing>
-          <wp:inline distT="0" distB="0" distL="0" distR="0" wp14:anchorId="13A61840" wp14:editId="07096A4F">
-            <wp:extent cx="2759319" cy="3081477"/>
-            <wp:effectExtent l="19050" t="19050" r="22225" b="24130"/>
+          <wp:inline distT="0" distB="0" distL="0" distR="0" wp14:anchorId="13A61840" wp14:editId="3A9FA655">
+            <wp:extent cx="2857848" cy="3191510"/>
+            <wp:effectExtent l="19050" t="19050" r="19050" b="27940"/>
             <wp:docPr id="935410972" name="Imagen 1"/>
             <wp:cNvGraphicFramePr>
               <a:graphicFrameLocks xmlns:a="http://schemas.openxmlformats.org/drawingml/2006/main" noChangeAspect="1"/>
@@ -7709,7 +7578,7 @@
                   <pic:spPr bwMode="auto">
                     <a:xfrm>
                       <a:off x="0" y="0"/>
-                      <a:ext cx="2806509" cy="3134177"/>
+                      <a:ext cx="2913789" cy="3253982"/>
                     </a:xfrm>
                     <a:prstGeom prst="rect">
                       <a:avLst/>
@@ -7767,13 +7636,12 @@
       <w:r>
         <w:rPr>
           <w:rFonts w:ascii="Arial" w:hAnsi="Arial" w:cs="Arial"/>
-          <w:noProof/>
         </w:rPr>
         <w:drawing>
-          <wp:inline distT="0" distB="0" distL="0" distR="0" wp14:anchorId="0C548524" wp14:editId="66D0CF5A">
-            <wp:extent cx="2396551" cy="3332480"/>
-            <wp:effectExtent l="19050" t="19050" r="22860" b="20320"/>
-            <wp:docPr id="945347987" name="Imagen 1"/>
+          <wp:inline distT="0" distB="0" distL="0" distR="0" wp14:anchorId="26D9B32F" wp14:editId="3E847DCA">
+            <wp:extent cx="2714613" cy="3007131"/>
+            <wp:effectExtent l="19050" t="19050" r="10160" b="22225"/>
+            <wp:docPr id="1435168398" name="Imagen 1"/>
             <wp:cNvGraphicFramePr>
               <a:graphicFrameLocks xmlns:a="http://schemas.openxmlformats.org/drawingml/2006/main" noChangeAspect="1"/>
             </wp:cNvGraphicFramePr>
@@ -7781,12 +7649,12 @@
               <a:graphicData uri="http://schemas.openxmlformats.org/drawingml/2006/picture">
                 <pic:pic xmlns:pic="http://schemas.openxmlformats.org/drawingml/2006/picture">
                   <pic:nvPicPr>
-                    <pic:cNvPr id="945347987" name=""/>
+                    <pic:cNvPr id="1435168398" name=""/>
                     <pic:cNvPicPr/>
                   </pic:nvPicPr>
                   <pic:blipFill rotWithShape="1">
                     <a:blip r:embed="rId31"/>
-                    <a:srcRect l="794" t="635"/>
+                    <a:srcRect l="496" t="523"/>
                     <a:stretch>
                       <a:fillRect/>
                     </a:stretch>
@@ -7794,7 +7662,7 @@
                   <pic:spPr bwMode="auto">
                     <a:xfrm>
                       <a:off x="0" y="0"/>
-                      <a:ext cx="2418181" cy="3362557"/>
+                      <a:ext cx="2732563" cy="3027015"/>
                     </a:xfrm>
                     <a:prstGeom prst="rect">
                       <a:avLst/>
@@ -7819,13 +7687,12 @@
       <w:r>
         <w:rPr>
           <w:rFonts w:ascii="Arial" w:hAnsi="Arial" w:cs="Arial"/>
-          <w:noProof/>
         </w:rPr>
         <w:drawing>
-          <wp:inline distT="0" distB="0" distL="0" distR="0" wp14:anchorId="4520311E" wp14:editId="7F935B17">
-            <wp:extent cx="3273397" cy="3325690"/>
-            <wp:effectExtent l="19050" t="19050" r="22860" b="27305"/>
-            <wp:docPr id="1699203137" name="Imagen 1"/>
+          <wp:inline distT="0" distB="0" distL="0" distR="0" wp14:anchorId="50C1A0DF" wp14:editId="7088FD3C">
+            <wp:extent cx="2922270" cy="3006485"/>
+            <wp:effectExtent l="19050" t="19050" r="11430" b="22860"/>
+            <wp:docPr id="1954363375" name="Imagen 1"/>
             <wp:cNvGraphicFramePr>
               <a:graphicFrameLocks xmlns:a="http://schemas.openxmlformats.org/drawingml/2006/main" noChangeAspect="1"/>
             </wp:cNvGraphicFramePr>
@@ -7833,12 +7700,12 @@
               <a:graphicData uri="http://schemas.openxmlformats.org/drawingml/2006/picture">
                 <pic:pic xmlns:pic="http://schemas.openxmlformats.org/drawingml/2006/picture">
                   <pic:nvPicPr>
-                    <pic:cNvPr id="1699203137" name=""/>
+                    <pic:cNvPr id="1954363375" name=""/>
                     <pic:cNvPicPr/>
                   </pic:nvPicPr>
                   <pic:blipFill rotWithShape="1">
                     <a:blip r:embed="rId32"/>
-                    <a:srcRect l="618" t="694"/>
+                    <a:srcRect l="529" t="600"/>
                     <a:stretch>
                       <a:fillRect/>
                     </a:stretch>
@@ -7846,7 +7713,7 @@
                   <pic:spPr bwMode="auto">
                     <a:xfrm>
                       <a:off x="0" y="0"/>
-                      <a:ext cx="3296131" cy="3348787"/>
+                      <a:ext cx="2938720" cy="3023409"/>
                     </a:xfrm>
                     <a:prstGeom prst="rect">
                       <a:avLst/>
@@ -7879,13 +7746,12 @@
       <w:r>
         <w:rPr>
           <w:rFonts w:ascii="Arial" w:hAnsi="Arial" w:cs="Arial"/>
-          <w:noProof/>
         </w:rPr>
         <w:drawing>
-          <wp:inline distT="0" distB="0" distL="0" distR="0" wp14:anchorId="1BA33BCB" wp14:editId="4455E747">
-            <wp:extent cx="2558575" cy="3075281"/>
-            <wp:effectExtent l="19050" t="19050" r="13335" b="11430"/>
-            <wp:docPr id="819115116" name="Imagen 1"/>
+          <wp:inline distT="0" distB="0" distL="0" distR="0" wp14:anchorId="59AC89BC" wp14:editId="51E535ED">
+            <wp:extent cx="2672884" cy="2675255"/>
+            <wp:effectExtent l="19050" t="19050" r="13335" b="10795"/>
+            <wp:docPr id="74381266" name="Imagen 1"/>
             <wp:cNvGraphicFramePr>
               <a:graphicFrameLocks xmlns:a="http://schemas.openxmlformats.org/drawingml/2006/main" noChangeAspect="1"/>
             </wp:cNvGraphicFramePr>
@@ -7893,12 +7759,12 @@
               <a:graphicData uri="http://schemas.openxmlformats.org/drawingml/2006/picture">
                 <pic:pic xmlns:pic="http://schemas.openxmlformats.org/drawingml/2006/picture">
                   <pic:nvPicPr>
-                    <pic:cNvPr id="819115116" name=""/>
+                    <pic:cNvPr id="74381266" name=""/>
                     <pic:cNvPicPr/>
                   </pic:nvPicPr>
                   <pic:blipFill rotWithShape="1">
                     <a:blip r:embed="rId33"/>
-                    <a:srcRect l="529"/>
+                    <a:srcRect l="529" t="441" b="1"/>
                     <a:stretch>
                       <a:fillRect/>
                     </a:stretch>
@@ -7906,7 +7772,7 @@
                   <pic:spPr bwMode="auto">
                     <a:xfrm>
                       <a:off x="0" y="0"/>
-                      <a:ext cx="2585559" cy="3107714"/>
+                      <a:ext cx="2693009" cy="2695398"/>
                     </a:xfrm>
                     <a:prstGeom prst="rect">
                       <a:avLst/>
@@ -7931,13 +7797,12 @@
       <w:r>
         <w:rPr>
           <w:rFonts w:ascii="Arial" w:hAnsi="Arial" w:cs="Arial"/>
-          <w:noProof/>
         </w:rPr>
         <w:drawing>
-          <wp:inline distT="0" distB="0" distL="0" distR="0" wp14:anchorId="2CE3F24A" wp14:editId="4BCB3527">
-            <wp:extent cx="3120390" cy="2544058"/>
-            <wp:effectExtent l="19050" t="19050" r="22860" b="27940"/>
-            <wp:docPr id="1781479433" name="Imagen 1"/>
+          <wp:inline distT="0" distB="0" distL="0" distR="0" wp14:anchorId="1B95F5C7" wp14:editId="1001782F">
+            <wp:extent cx="3013710" cy="2678334"/>
+            <wp:effectExtent l="19050" t="19050" r="15240" b="27305"/>
+            <wp:docPr id="175142938" name="Imagen 1"/>
             <wp:cNvGraphicFramePr>
               <a:graphicFrameLocks xmlns:a="http://schemas.openxmlformats.org/drawingml/2006/main" noChangeAspect="1"/>
             </wp:cNvGraphicFramePr>
@@ -7945,12 +7810,12 @@
               <a:graphicData uri="http://schemas.openxmlformats.org/drawingml/2006/picture">
                 <pic:pic xmlns:pic="http://schemas.openxmlformats.org/drawingml/2006/picture">
                   <pic:nvPicPr>
-                    <pic:cNvPr id="1781479433" name=""/>
+                    <pic:cNvPr id="175142938" name=""/>
                     <pic:cNvPicPr/>
                   </pic:nvPicPr>
                   <pic:blipFill rotWithShape="1">
                     <a:blip r:embed="rId34"/>
-                    <a:srcRect l="1221"/>
+                    <a:srcRect l="331" t="496"/>
                     <a:stretch>
                       <a:fillRect/>
                     </a:stretch>
@@ -7958,7 +7823,7 @@
                   <pic:spPr bwMode="auto">
                     <a:xfrm>
                       <a:off x="0" y="0"/>
-                      <a:ext cx="3121921" cy="2545306"/>
+                      <a:ext cx="3038488" cy="2700354"/>
                     </a:xfrm>
                     <a:prstGeom prst="rect">
                       <a:avLst/>
@@ -7983,12 +7848,85 @@
     </w:p>
     <w:p>
       <w:pPr>
+        <w:spacing w:line="240" w:lineRule="auto"/>
+        <w:jc w:val="center"/>
+        <w:rPr>
+          <w:rFonts w:ascii="Arial" w:hAnsi="Arial" w:cs="Arial"/>
+        </w:rPr>
+      </w:pPr>
+      <w:r>
+        <w:rPr>
+          <w:rFonts w:ascii="Arial" w:hAnsi="Arial" w:cs="Arial"/>
+        </w:rPr>
+        <w:drawing>
+          <wp:inline distT="0" distB="0" distL="0" distR="0" wp14:anchorId="29B540F5" wp14:editId="4063EDE8">
+            <wp:extent cx="3171615" cy="2840990"/>
+            <wp:effectExtent l="19050" t="19050" r="10160" b="16510"/>
+            <wp:docPr id="94353612" name="Imagen 1"/>
+            <wp:cNvGraphicFramePr>
+              <a:graphicFrameLocks xmlns:a="http://schemas.openxmlformats.org/drawingml/2006/main" noChangeAspect="1"/>
+            </wp:cNvGraphicFramePr>
+            <a:graphic xmlns:a="http://schemas.openxmlformats.org/drawingml/2006/main">
+              <a:graphicData uri="http://schemas.openxmlformats.org/drawingml/2006/picture">
+                <pic:pic xmlns:pic="http://schemas.openxmlformats.org/drawingml/2006/picture">
+                  <pic:nvPicPr>
+                    <pic:cNvPr id="94353612" name=""/>
+                    <pic:cNvPicPr/>
+                  </pic:nvPicPr>
+                  <pic:blipFill rotWithShape="1">
+                    <a:blip r:embed="rId35"/>
+                    <a:srcRect l="794" t="886"/>
+                    <a:stretch>
+                      <a:fillRect/>
+                    </a:stretch>
+                  </pic:blipFill>
+                  <pic:spPr bwMode="auto">
+                    <a:xfrm>
+                      <a:off x="0" y="0"/>
+                      <a:ext cx="3204261" cy="2870233"/>
+                    </a:xfrm>
+                    <a:prstGeom prst="rect">
+                      <a:avLst/>
+                    </a:prstGeom>
+                    <a:ln>
+                      <a:solidFill>
+                        <a:schemeClr val="tx1"/>
+                      </a:solidFill>
+                    </a:ln>
+                    <a:extLst>
+                      <a:ext uri="{53640926-AAD7-44D8-BBD7-CCE9431645EC}">
+                        <a14:shadowObscured xmlns:a14="http://schemas.microsoft.com/office/drawing/2010/main"/>
+                      </a:ext>
+                    </a:extLst>
+                  </pic:spPr>
+                </pic:pic>
+              </a:graphicData>
+            </a:graphic>
+          </wp:inline>
+        </w:drawing>
+      </w:r>
+    </w:p>
+    <w:p>
+      <w:pPr>
         <w:spacing w:line="360" w:lineRule="auto"/>
         <w:ind w:left="426"/>
         <w:rPr>
           <w:rFonts w:ascii="Arial" w:hAnsi="Arial" w:cs="Arial"/>
         </w:rPr>
       </w:pPr>
+      <w:r>
+        <w:rPr>
+          <w:rFonts w:ascii="Arial" w:hAnsi="Arial" w:cs="Arial"/>
+        </w:rPr>
+        <w:lastRenderedPageBreak/>
+        <w:t>E</w:t>
+      </w:r>
+      <w:r>
+        <w:rPr>
+          <w:rFonts w:ascii="Arial" w:hAnsi="Arial" w:cs="Arial"/>
+        </w:rPr>
+        <w:t>l código refactorizado implementa un chatbot para control de hipertensión que se conecta a una base de datos MySQL y organiza sus funciones de manera modular: primero define una utilidad para ejecutar consultas SQL con manejo de errores, luego incluye funciones específicas para registrar signos vitales, consultar registros con información de pacientes, eliminar registros por ID y agregar observaciones médicas, todo ello gestionado desde un menú principal que ofrece opciones claras al usuario; gracias a esta estructura, el sistema es más legible, fácil de mantener y garantiza que los datos capturados se transformen en información útil para apoyar la gestión clínica.</w:t>
+      </w:r>
     </w:p>
     <w:p>
       <w:pPr>
@@ -7998,18 +7936,15 @@
           <w:rFonts w:ascii="Arial" w:hAnsi="Arial" w:cs="Arial"/>
         </w:rPr>
       </w:pPr>
-      <w:r>
-        <w:rPr>
-          <w:rFonts w:ascii="Arial" w:hAnsi="Arial" w:cs="Arial"/>
-        </w:rPr>
-        <w:t>E</w:t>
-      </w:r>
-      <w:r>
-        <w:rPr>
-          <w:rFonts w:ascii="Arial" w:hAnsi="Arial" w:cs="Arial"/>
-        </w:rPr>
-        <w:t>l código refactorizado implementa un chatbot para control de hipertensión que se conecta a una base de datos MySQL y organiza sus funciones de manera modular: primero define una utilidad para ejecutar consultas SQL con manejo de errores, luego incluye funciones específicas para registrar signos vitales, consultar registros con información de pacientes, eliminar registros por ID y agregar observaciones médicas, todo ello gestionado desde un menú principal que ofrece opciones claras al usuario; gracias a esta estructura, el sistema es más legible, fácil de mantener y garantiza que los datos capturados se transformen en información útil para apoyar la gestión clínica.</w:t>
-      </w:r>
+    </w:p>
+    <w:p>
+      <w:pPr>
+        <w:spacing w:line="360" w:lineRule="auto"/>
+        <w:ind w:left="426"/>
+        <w:rPr>
+          <w:rFonts w:ascii="Arial" w:hAnsi="Arial" w:cs="Arial"/>
+        </w:rPr>
+      </w:pPr>
     </w:p>
     <w:p>
       <w:pPr>
@@ -8032,7 +7967,6 @@
           <w:b/>
           <w:bCs/>
         </w:rPr>
-        <w:lastRenderedPageBreak/>
         <w:t>Resultados de Pruebas:</w:t>
       </w:r>
     </w:p>
@@ -8842,8 +8776,18 @@
         <w:rPr>
           <w:rFonts w:ascii="Arial" w:hAnsi="Arial" w:cs="Arial"/>
         </w:rPr>
+        <w:lastRenderedPageBreak/>
         <w:t>Las pruebas realizadas permitieron validar el correcto funcionamiento de las principales funcionalidades del sistema. Los resultados obtenidos demuestran que el chatbot permite registrar, almacenar, consultar y gestionar la información de signos vitales de los pacientes de manera adecuada, garantizando el correcto manejo de los datos dentro del sistema. Asimismo, las pruebas permitieron verificar que la información ingresada por los usuarios se almacena correctamente en la base de datos gestionada por MySQL, y que las consultas realizadas desde el chatbot muestran los registros de forma clara y ordenada. De igual manera, se comprobó que las funciones de eliminación de registros y de adición de observaciones médicas se ejecutan sin errores, lo cual confirma la estabilidad y confiabilidad del sistema desarrollado en Python.</w:t>
       </w:r>
+    </w:p>
+    <w:p>
+      <w:pPr>
+        <w:spacing w:line="360" w:lineRule="auto"/>
+        <w:ind w:left="426"/>
+        <w:rPr>
+          <w:rFonts w:ascii="Arial" w:hAnsi="Arial" w:cs="Arial"/>
+        </w:rPr>
+      </w:pPr>
     </w:p>
     <w:p>
       <w:pPr>
@@ -8866,7 +8810,6 @@
           <w:b/>
           <w:bCs/>
         </w:rPr>
-        <w:lastRenderedPageBreak/>
         <w:t>Pruebas</w:t>
       </w:r>
       <w:r>
@@ -8885,18 +8828,6 @@
         </w:rPr>
         <w:t>:</w:t>
       </w:r>
-    </w:p>
-    <w:p>
-      <w:pPr>
-        <w:pStyle w:val="Prrafodelista"/>
-        <w:spacing w:line="360" w:lineRule="auto"/>
-        <w:ind w:left="426"/>
-        <w:rPr>
-          <w:rFonts w:ascii="Arial" w:hAnsi="Arial" w:cs="Arial"/>
-          <w:b/>
-          <w:bCs/>
-        </w:rPr>
-      </w:pPr>
     </w:p>
     <w:tbl>
       <w:tblPr>
@@ -9408,14 +9339,6 @@
         <w:t>4. Cerrar sesión</w:t>
       </w:r>
     </w:p>
-    <w:p>
-      <w:pPr>
-        <w:spacing w:line="360" w:lineRule="auto"/>
-        <w:rPr>
-          <w:rFonts w:ascii="Arial" w:hAnsi="Arial" w:cs="Arial"/>
-        </w:rPr>
-      </w:pPr>
-    </w:p>
     <w:tbl>
       <w:tblPr>
         <w:tblStyle w:val="Tablaconcuadrcula"/>
@@ -9458,6 +9381,7 @@
                 <w:sz w:val="22"/>
                 <w:szCs w:val="22"/>
               </w:rPr>
+              <w:lastRenderedPageBreak/>
               <w:t>ID Prueba</w:t>
             </w:r>
           </w:p>
@@ -9721,19 +9645,10 @@
           <w:rFonts w:ascii="Arial" w:hAnsi="Arial" w:cs="Arial"/>
         </w:rPr>
       </w:pPr>
-    </w:p>
-    <w:p>
-      <w:pPr>
-        <w:spacing w:line="360" w:lineRule="auto"/>
-        <w:rPr>
-          <w:rFonts w:ascii="Arial" w:hAnsi="Arial" w:cs="Arial"/>
-        </w:rPr>
-      </w:pPr>
-      <w:r>
-        <w:rPr>
-          <w:rFonts w:ascii="Arial" w:hAnsi="Arial" w:cs="Arial"/>
-        </w:rPr>
-        <w:lastRenderedPageBreak/>
+      <w:r>
+        <w:rPr>
+          <w:rFonts w:ascii="Arial" w:hAnsi="Arial" w:cs="Arial"/>
+        </w:rPr>
         <w:t>==============================</w:t>
       </w:r>
     </w:p>
@@ -10201,14 +10116,6 @@
           <w:rFonts w:ascii="Arial" w:hAnsi="Arial" w:cs="Arial"/>
         </w:rPr>
       </w:pPr>
-    </w:p>
-    <w:p>
-      <w:pPr>
-        <w:spacing w:line="360" w:lineRule="auto"/>
-        <w:rPr>
-          <w:rFonts w:ascii="Arial" w:hAnsi="Arial" w:cs="Arial"/>
-        </w:rPr>
-      </w:pPr>
       <w:r>
         <w:rPr>
           <w:rFonts w:ascii="Arial" w:hAnsi="Arial" w:cs="Arial"/>
@@ -10279,14 +10186,6 @@
           <w:rFonts w:ascii="Arial" w:hAnsi="Arial" w:cs="Arial"/>
         </w:rPr>
       </w:pPr>
-    </w:p>
-    <w:p>
-      <w:pPr>
-        <w:spacing w:line="360" w:lineRule="auto"/>
-        <w:rPr>
-          <w:rFonts w:ascii="Arial" w:hAnsi="Arial" w:cs="Arial"/>
-        </w:rPr>
-      </w:pPr>
       <w:r>
         <w:rPr>
           <w:rFonts w:ascii="Arial" w:hAnsi="Arial" w:cs="Arial"/>
@@ -10369,6 +10268,7 @@
         <w:rPr>
           <w:rFonts w:ascii="Arial" w:hAnsi="Arial" w:cs="Arial"/>
         </w:rPr>
+        <w:lastRenderedPageBreak/>
         <w:t>1. Registrar mis signos vitales</w:t>
       </w:r>
     </w:p>
@@ -10453,7 +10353,6 @@
         <w:rPr>
           <w:rFonts w:ascii="Arial" w:hAnsi="Arial" w:cs="Arial"/>
         </w:rPr>
-        <w:lastRenderedPageBreak/>
         <w:t>Ingrese presión arterial (</w:t>
       </w:r>
       <w:proofErr w:type="spellStart"/>
@@ -10892,14 +10791,6 @@
           <w:rFonts w:ascii="Arial" w:hAnsi="Arial" w:cs="Arial"/>
         </w:rPr>
       </w:pPr>
-    </w:p>
-    <w:p>
-      <w:pPr>
-        <w:spacing w:line="360" w:lineRule="auto"/>
-        <w:rPr>
-          <w:rFonts w:ascii="Arial" w:hAnsi="Arial" w:cs="Arial"/>
-        </w:rPr>
-      </w:pPr>
       <w:r>
         <w:rPr>
           <w:rFonts w:ascii="Arial" w:hAnsi="Arial" w:cs="Arial"/>
@@ -11099,30 +10990,6 @@
         </w:rPr>
         <w:t xml:space="preserve"> | Fecha: 2026-03-18 21:29:53</w:t>
       </w:r>
-    </w:p>
-    <w:p>
-      <w:pPr>
-        <w:spacing w:line="360" w:lineRule="auto"/>
-        <w:rPr>
-          <w:rFonts w:ascii="Arial" w:hAnsi="Arial" w:cs="Arial"/>
-        </w:rPr>
-      </w:pPr>
-    </w:p>
-    <w:p>
-      <w:pPr>
-        <w:spacing w:line="360" w:lineRule="auto"/>
-        <w:rPr>
-          <w:rFonts w:ascii="Arial" w:hAnsi="Arial" w:cs="Arial"/>
-        </w:rPr>
-      </w:pPr>
-    </w:p>
-    <w:p>
-      <w:pPr>
-        <w:spacing w:line="360" w:lineRule="auto"/>
-        <w:rPr>
-          <w:rFonts w:ascii="Arial" w:hAnsi="Arial" w:cs="Arial"/>
-        </w:rPr>
-      </w:pPr>
     </w:p>
     <w:p>
       <w:pPr>
@@ -11159,7 +11026,7 @@
         </w:trPr>
         <w:tc>
           <w:tcPr>
-            <w:tcW w:w="1320" w:type="dxa"/>
+            <w:tcW w:w="1175" w:type="dxa"/>
             <w:hideMark/>
           </w:tcPr>
           <w:p>
@@ -11189,7 +11056,7 @@
         </w:tc>
         <w:tc>
           <w:tcPr>
-            <w:tcW w:w="1320" w:type="dxa"/>
+            <w:tcW w:w="1219" w:type="dxa"/>
             <w:hideMark/>
           </w:tcPr>
           <w:p>
@@ -11218,7 +11085,7 @@
         </w:tc>
         <w:tc>
           <w:tcPr>
-            <w:tcW w:w="2140" w:type="dxa"/>
+            <w:tcW w:w="1869" w:type="dxa"/>
             <w:hideMark/>
           </w:tcPr>
           <w:p>
@@ -11247,7 +11114,7 @@
         </w:tc>
         <w:tc>
           <w:tcPr>
-            <w:tcW w:w="2620" w:type="dxa"/>
+            <w:tcW w:w="2109" w:type="dxa"/>
             <w:hideMark/>
           </w:tcPr>
           <w:p>
@@ -11276,7 +11143,7 @@
         </w:tc>
         <w:tc>
           <w:tcPr>
-            <w:tcW w:w="3420" w:type="dxa"/>
+            <w:tcW w:w="2688" w:type="dxa"/>
             <w:hideMark/>
           </w:tcPr>
           <w:p>
@@ -11310,7 +11177,7 @@
         </w:trPr>
         <w:tc>
           <w:tcPr>
-            <w:tcW w:w="1320" w:type="dxa"/>
+            <w:tcW w:w="1175" w:type="dxa"/>
             <w:hideMark/>
           </w:tcPr>
           <w:p>
@@ -11334,7 +11201,7 @@
         </w:tc>
         <w:tc>
           <w:tcPr>
-            <w:tcW w:w="1320" w:type="dxa"/>
+            <w:tcW w:w="1219" w:type="dxa"/>
             <w:hideMark/>
           </w:tcPr>
           <w:p>
@@ -11358,7 +11225,7 @@
         </w:tc>
         <w:tc>
           <w:tcPr>
-            <w:tcW w:w="2140" w:type="dxa"/>
+            <w:tcW w:w="1869" w:type="dxa"/>
             <w:hideMark/>
           </w:tcPr>
           <w:p>
@@ -11382,7 +11249,7 @@
         </w:tc>
         <w:tc>
           <w:tcPr>
-            <w:tcW w:w="2620" w:type="dxa"/>
+            <w:tcW w:w="2109" w:type="dxa"/>
             <w:hideMark/>
           </w:tcPr>
           <w:p>
@@ -11424,7 +11291,7 @@
         </w:tc>
         <w:tc>
           <w:tcPr>
-            <w:tcW w:w="3420" w:type="dxa"/>
+            <w:tcW w:w="2688" w:type="dxa"/>
             <w:hideMark/>
           </w:tcPr>
           <w:p>
@@ -11448,14 +11315,6 @@
         </w:tc>
       </w:tr>
     </w:tbl>
-    <w:p>
-      <w:pPr>
-        <w:spacing w:line="360" w:lineRule="auto"/>
-        <w:rPr>
-          <w:rFonts w:ascii="Arial" w:hAnsi="Arial" w:cs="Arial"/>
-        </w:rPr>
-      </w:pPr>
-    </w:p>
     <w:p>
       <w:pPr>
         <w:spacing w:line="360" w:lineRule="auto"/>
@@ -11690,7 +11549,7 @@
                     <pic:cNvPicPr/>
                   </pic:nvPicPr>
                   <pic:blipFill>
-                    <a:blip r:embed="rId35"/>
+                    <a:blip r:embed="rId36"/>
                     <a:stretch>
                       <a:fillRect/>
                     </a:stretch>
@@ -11773,7 +11632,7 @@
                     <pic:cNvPicPr/>
                   </pic:nvPicPr>
                   <pic:blipFill>
-                    <a:blip r:embed="rId36"/>
+                    <a:blip r:embed="rId37"/>
                     <a:stretch>
                       <a:fillRect/>
                     </a:stretch>
@@ -12090,8 +11949,18 @@
                 <w:sz w:val="22"/>
                 <w:szCs w:val="22"/>
               </w:rPr>
-              <w:t xml:space="preserve"> / 123456) .</w:t>
+              <w:t xml:space="preserve"> / 123456</w:t>
             </w:r>
+            <w:proofErr w:type="gramStart"/>
+            <w:r>
+              <w:rPr>
+                <w:rFonts w:ascii="Arial" w:hAnsi="Arial" w:cs="Arial"/>
+                <w:sz w:val="22"/>
+                <w:szCs w:val="22"/>
+              </w:rPr>
+              <w:t>) .</w:t>
+            </w:r>
+            <w:proofErr w:type="gramEnd"/>
             <w:r>
               <w:rPr>
                 <w:rFonts w:ascii="Arial" w:hAnsi="Arial" w:cs="Arial"/>
@@ -12199,14 +12068,6 @@
           <w:rFonts w:ascii="Arial" w:hAnsi="Arial" w:cs="Arial"/>
         </w:rPr>
       </w:pPr>
-    </w:p>
-    <w:p>
-      <w:pPr>
-        <w:spacing w:line="360" w:lineRule="auto"/>
-        <w:rPr>
-          <w:rFonts w:ascii="Arial" w:hAnsi="Arial" w:cs="Arial"/>
-        </w:rPr>
-      </w:pPr>
       <w:r>
         <w:rPr>
           <w:rFonts w:ascii="Arial" w:hAnsi="Arial" w:cs="Arial"/>
@@ -12277,14 +12138,6 @@
           <w:rFonts w:ascii="Arial" w:hAnsi="Arial" w:cs="Arial"/>
         </w:rPr>
       </w:pPr>
-    </w:p>
-    <w:p>
-      <w:pPr>
-        <w:spacing w:line="360" w:lineRule="auto"/>
-        <w:rPr>
-          <w:rFonts w:ascii="Arial" w:hAnsi="Arial" w:cs="Arial"/>
-        </w:rPr>
-      </w:pPr>
       <w:r>
         <w:rPr>
           <w:rFonts w:ascii="Arial" w:hAnsi="Arial" w:cs="Arial"/>
@@ -12505,27 +12358,10 @@
           <w:rFonts w:ascii="Arial" w:hAnsi="Arial" w:cs="Arial"/>
         </w:rPr>
       </w:pPr>
-    </w:p>
-    <w:p>
-      <w:pPr>
-        <w:spacing w:line="360" w:lineRule="auto"/>
-        <w:rPr>
-          <w:rFonts w:ascii="Arial" w:hAnsi="Arial" w:cs="Arial"/>
-        </w:rPr>
-      </w:pPr>
-    </w:p>
-    <w:p>
-      <w:pPr>
-        <w:spacing w:line="360" w:lineRule="auto"/>
-        <w:rPr>
-          <w:rFonts w:ascii="Arial" w:hAnsi="Arial" w:cs="Arial"/>
-        </w:rPr>
-      </w:pPr>
-      <w:r>
-        <w:rPr>
-          <w:rFonts w:ascii="Arial" w:hAnsi="Arial" w:cs="Arial"/>
-        </w:rPr>
-        <w:lastRenderedPageBreak/>
+      <w:r>
+        <w:rPr>
+          <w:rFonts w:ascii="Arial" w:hAnsi="Arial" w:cs="Arial"/>
+        </w:rPr>
         <w:t>--- HISTORIAL DE SIGNOS VITALES ---</w:t>
       </w:r>
     </w:p>
@@ -12599,6 +12435,7 @@
         <w:rPr>
           <w:rFonts w:ascii="Arial" w:hAnsi="Arial" w:cs="Arial"/>
         </w:rPr>
+        <w:lastRenderedPageBreak/>
         <w:t xml:space="preserve">ID Registro: 4 | Paciente: Jhon Manrique | PA: 120/80 | T: 37.00°C | SatO2: 90% | FC: 70 </w:t>
       </w:r>
       <w:proofErr w:type="spellStart"/>
@@ -12984,14 +12821,6 @@
           <w:rFonts w:ascii="Arial" w:hAnsi="Arial" w:cs="Arial"/>
         </w:rPr>
       </w:pPr>
-    </w:p>
-    <w:p>
-      <w:pPr>
-        <w:spacing w:line="360" w:lineRule="auto"/>
-        <w:rPr>
-          <w:rFonts w:ascii="Arial" w:hAnsi="Arial" w:cs="Arial"/>
-        </w:rPr>
-      </w:pPr>
       <w:r>
         <w:rPr>
           <w:rFonts w:ascii="Arial" w:hAnsi="Arial" w:cs="Arial"/>
@@ -13062,14 +12891,6 @@
           <w:rFonts w:ascii="Arial" w:hAnsi="Arial" w:cs="Arial"/>
         </w:rPr>
       </w:pPr>
-    </w:p>
-    <w:p>
-      <w:pPr>
-        <w:spacing w:line="360" w:lineRule="auto"/>
-        <w:rPr>
-          <w:rFonts w:ascii="Arial" w:hAnsi="Arial" w:cs="Arial"/>
-        </w:rPr>
-      </w:pPr>
       <w:r>
         <w:rPr>
           <w:rFonts w:ascii="Arial" w:hAnsi="Arial" w:cs="Arial"/>
@@ -13236,41 +13057,41 @@
         <w:rPr>
           <w:rFonts w:ascii="Arial" w:hAnsi="Arial" w:cs="Arial"/>
         </w:rPr>
+        <w:t>Ingrese ID del médico: 1</w:t>
+      </w:r>
+    </w:p>
+    <w:p>
+      <w:pPr>
+        <w:spacing w:line="360" w:lineRule="auto"/>
+        <w:rPr>
+          <w:rFonts w:ascii="Arial" w:hAnsi="Arial" w:cs="Arial"/>
+        </w:rPr>
+      </w:pPr>
+      <w:r>
+        <w:rPr>
+          <w:rFonts w:ascii="Arial" w:hAnsi="Arial" w:cs="Arial"/>
+        </w:rPr>
+        <w:t>Ingrese observación médica: mantener dieta</w:t>
+      </w:r>
+    </w:p>
+    <w:p>
+      <w:pPr>
+        <w:spacing w:line="360" w:lineRule="auto"/>
+      </w:pPr>
+      <w:r>
+        <w:rPr>
+          <w:rFonts w:ascii="Arial" w:hAnsi="Arial" w:cs="Arial"/>
+        </w:rPr>
+        <w:t>Observación registrada correctamente.</w:t>
+      </w:r>
+    </w:p>
+    <w:p/>
+    <w:p>
+      <w:r>
+        <w:rPr>
+          <w:noProof/>
+        </w:rPr>
         <w:lastRenderedPageBreak/>
-        <w:t>Ingrese ID del médico: 1</w:t>
-      </w:r>
-    </w:p>
-    <w:p>
-      <w:pPr>
-        <w:spacing w:line="360" w:lineRule="auto"/>
-        <w:rPr>
-          <w:rFonts w:ascii="Arial" w:hAnsi="Arial" w:cs="Arial"/>
-        </w:rPr>
-      </w:pPr>
-      <w:r>
-        <w:rPr>
-          <w:rFonts w:ascii="Arial" w:hAnsi="Arial" w:cs="Arial"/>
-        </w:rPr>
-        <w:t>Ingrese observación médica: mantener dieta</w:t>
-      </w:r>
-    </w:p>
-    <w:p>
-      <w:pPr>
-        <w:spacing w:line="360" w:lineRule="auto"/>
-      </w:pPr>
-      <w:r>
-        <w:rPr>
-          <w:rFonts w:ascii="Arial" w:hAnsi="Arial" w:cs="Arial"/>
-        </w:rPr>
-        <w:t>Observación registrada correctamente.</w:t>
-      </w:r>
-    </w:p>
-    <w:p/>
-    <w:p>
-      <w:r>
-        <w:rPr>
-          <w:noProof/>
-        </w:rPr>
         <w:drawing>
           <wp:inline distT="0" distB="0" distL="0" distR="0" wp14:anchorId="59431565" wp14:editId="7D98A4CC">
             <wp:extent cx="5612130" cy="1169670"/>
@@ -13287,7 +13108,7 @@
                     <pic:cNvPicPr/>
                   </pic:nvPicPr>
                   <pic:blipFill>
-                    <a:blip r:embed="rId37"/>
+                    <a:blip r:embed="rId38"/>
                     <a:stretch>
                       <a:fillRect/>
                     </a:stretch>
@@ -13332,17 +13153,6 @@
     </w:p>
     <w:p>
       <w:pPr>
-        <w:spacing w:line="360" w:lineRule="auto"/>
-        <w:ind w:left="426"/>
-        <w:rPr>
-          <w:rFonts w:ascii="Arial" w:hAnsi="Arial" w:cs="Arial"/>
-          <w:sz w:val="18"/>
-          <w:szCs w:val="18"/>
-        </w:rPr>
-      </w:pPr>
-    </w:p>
-    <w:p>
-      <w:pPr>
         <w:pStyle w:val="Prrafodelista"/>
         <w:numPr>
           <w:ilvl w:val="0"/>
@@ -13616,12 +13426,12 @@
       </w:pPr>
     </w:p>
     <w:sectPr>
-      <w:headerReference w:type="even" r:id="rId38"/>
-      <w:headerReference w:type="default" r:id="rId39"/>
-      <w:footerReference w:type="even" r:id="rId40"/>
-      <w:footerReference w:type="default" r:id="rId41"/>
-      <w:headerReference w:type="first" r:id="rId42"/>
-      <w:footerReference w:type="first" r:id="rId43"/>
+      <w:headerReference w:type="even" r:id="rId39"/>
+      <w:headerReference w:type="default" r:id="rId40"/>
+      <w:footerReference w:type="even" r:id="rId41"/>
+      <w:footerReference w:type="default" r:id="rId42"/>
+      <w:headerReference w:type="first" r:id="rId43"/>
+      <w:footerReference w:type="first" r:id="rId44"/>
       <w:pgSz w:w="11906" w:h="16838"/>
       <w:pgMar w:top="1418" w:right="1418" w:bottom="1418" w:left="1418" w:header="709" w:footer="709" w:gutter="0"/>
       <w:cols w:space="708"/>
@@ -20595,6 +20405,7 @@
   <w:style w:type="character" w:default="1" w:styleId="Fuentedeprrafopredeter">
     <w:name w:val="Default Paragraph Font"/>
     <w:uiPriority w:val="1"/>
+    <w:semiHidden/>
     <w:unhideWhenUsed/>
   </w:style>
   <w:style w:type="table" w:default="1" w:styleId="Tablanormal">

</xml_diff>